<commit_message>
Add the frequency distribution table the Checkpoint 2 report was missing
Task 2.2 asks for a frequency distribution table and the report had only the
histogram — the table itself lived in the workbook, where a marker reading the
printed report would not see it. It is now Table 5, ten bins of 1,000 counted
from the source file: no bin holds more than 11.4% and none less than 7.0%,
which is the flatness the surrounding paragraphs claim.

Also added the two screenshot placeholders the report lacked, for the
PivotTables and PivotCharts under Task 2.1 and for the ToolPak regression
output under Task 2.4, matching the convention now used in Checkpoint 1.

Co-Authored-By: Claude Opus 5 <noreply@anthropic.com>
Claude-Session: https://claude.ai/code/session_01VZUVZ4Kh74tBbebjZDm9fE
</commit_message>
<xml_diff>
--- a/reports/Checkpoint_2_Report.docx
+++ b/reports/Checkpoint_2_Report.docx
@@ -1693,6 +1693,11 @@
           <w:sz w:val="20"/>
         </w:rPr>
         <w:t>Table 3. Workbook structure and the task each sheet satisfies.</w:t>
+      </w:r>
+    </w:p>
+    <w:p>
+      <w:r>
+        <w:t>_(Insert your screenshots of the three PivotTables and their PivotCharts here, taken from the workbook after opening it in Excel.)_</w:t>
       </w:r>
     </w:p>
     <w:p>
@@ -3275,6 +3280,1109 @@
     </w:p>
     <w:p>
       <w:pPr>
+        <w:pStyle w:val="Heading2"/>
+      </w:pPr>
+      <w:r>
+        <w:t>Frequency distribution of Amount</w:t>
+      </w:r>
+    </w:p>
+    <w:p>
+      <w:r>
+        <w:t xml:space="preserve">Ten bins of 1,000, counted with </w:t>
+      </w:r>
+      <w:r>
+        <w:rPr>
+          <w:rFonts w:ascii="Consolas" w:hAnsi="Consolas"/>
+          <w:color w:val="2F6F9F"/>
+          <w:sz w:val="18"/>
+        </w:rPr>
+        <w:t>COUNTIFS</w:t>
+      </w:r>
+      <w:r>
+        <w:t xml:space="preserve"> rather than the </w:t>
+      </w:r>
+      <w:r>
+        <w:rPr>
+          <w:rFonts w:ascii="Consolas" w:hAnsi="Consolas"/>
+          <w:color w:val="2F6F9F"/>
+          <w:sz w:val="18"/>
+        </w:rPr>
+        <w:t>FREQUENCY</w:t>
+      </w:r>
+      <w:r>
+        <w:t xml:space="preserve"> array function so that every cell is independent and auditable. The bin counts sum to 1,194, which the workbook checks against </w:t>
+      </w:r>
+      <w:r>
+        <w:rPr>
+          <w:rFonts w:ascii="Consolas" w:hAnsi="Consolas"/>
+          <w:color w:val="2F6F9F"/>
+          <w:sz w:val="18"/>
+        </w:rPr>
+        <w:t>COUNT(Amount)</w:t>
+      </w:r>
+      <w:r>
+        <w:t>.</w:t>
+      </w:r>
+    </w:p>
+    <w:tbl>
+      <w:tblPr>
+        <w:tblStyle w:val="LightGrid-Accent1"/>
+        <w:tblW w:type="auto" w:w="0"/>
+        <w:jc w:val="center"/>
+        <w:tblLayout w:type="autofit"/>
+        <w:tblLook w:firstColumn="1" w:firstRow="1" w:lastColumn="0" w:lastRow="0" w:noHBand="0" w:noVBand="1" w:val="04A0"/>
+      </w:tblPr>
+      <w:tblGrid>
+        <w:gridCol w:w="2340"/>
+        <w:gridCol w:w="2340"/>
+        <w:gridCol w:w="2340"/>
+        <w:gridCol w:w="2340"/>
+      </w:tblGrid>
+      <w:tr>
+        <w:tc>
+          <w:tcPr>
+            <w:tcW w:type="dxa" w:w="2340"/>
+          </w:tcPr>
+          <w:p>
+            <w:r>
+              <w:rPr>
+                <w:b/>
+              </w:rPr>
+            </w:r>
+            <w:r>
+              <w:rPr>
+                <w:b/>
+              </w:rPr>
+              <w:t>Bin (Amount)</w:t>
+            </w:r>
+          </w:p>
+        </w:tc>
+        <w:tc>
+          <w:tcPr>
+            <w:tcW w:type="dxa" w:w="2340"/>
+          </w:tcPr>
+          <w:p>
+            <w:r>
+              <w:rPr>
+                <w:b/>
+              </w:rPr>
+            </w:r>
+            <w:r>
+              <w:rPr>
+                <w:b/>
+              </w:rPr>
+              <w:t>Frequency</w:t>
+            </w:r>
+          </w:p>
+        </w:tc>
+        <w:tc>
+          <w:tcPr>
+            <w:tcW w:type="dxa" w:w="2340"/>
+          </w:tcPr>
+          <w:p>
+            <w:r>
+              <w:rPr>
+                <w:b/>
+              </w:rPr>
+            </w:r>
+            <w:r>
+              <w:rPr>
+                <w:b/>
+              </w:rPr>
+              <w:t>Relative %</w:t>
+            </w:r>
+          </w:p>
+        </w:tc>
+        <w:tc>
+          <w:tcPr>
+            <w:tcW w:type="dxa" w:w="2340"/>
+          </w:tcPr>
+          <w:p>
+            <w:r>
+              <w:rPr>
+                <w:b/>
+              </w:rPr>
+            </w:r>
+            <w:r>
+              <w:rPr>
+                <w:b/>
+              </w:rPr>
+              <w:t>Cumulative %</w:t>
+            </w:r>
+          </w:p>
+        </w:tc>
+      </w:tr>
+      <w:tr>
+        <w:tc>
+          <w:tcPr>
+            <w:tcW w:type="dxa" w:w="2340"/>
+          </w:tcPr>
+          <w:p>
+            <w:pPr>
+              <w:spacing w:line="240" w:lineRule="auto"/>
+            </w:pPr>
+            <w:r>
+              <w:rPr>
+                <w:sz w:val="18"/>
+              </w:rPr>
+            </w:r>
+            <w:r>
+              <w:rPr>
+                <w:sz w:val="18"/>
+              </w:rPr>
+              <w:t>0 – 999</w:t>
+            </w:r>
+          </w:p>
+        </w:tc>
+        <w:tc>
+          <w:tcPr>
+            <w:tcW w:type="dxa" w:w="2340"/>
+          </w:tcPr>
+          <w:p>
+            <w:pPr>
+              <w:spacing w:line="240" w:lineRule="auto"/>
+            </w:pPr>
+            <w:r>
+              <w:rPr>
+                <w:sz w:val="18"/>
+              </w:rPr>
+            </w:r>
+            <w:r>
+              <w:rPr>
+                <w:sz w:val="18"/>
+              </w:rPr>
+              <w:t>83</w:t>
+            </w:r>
+          </w:p>
+        </w:tc>
+        <w:tc>
+          <w:tcPr>
+            <w:tcW w:type="dxa" w:w="2340"/>
+          </w:tcPr>
+          <w:p>
+            <w:pPr>
+              <w:spacing w:line="240" w:lineRule="auto"/>
+            </w:pPr>
+            <w:r>
+              <w:rPr>
+                <w:sz w:val="18"/>
+              </w:rPr>
+            </w:r>
+            <w:r>
+              <w:rPr>
+                <w:sz w:val="18"/>
+              </w:rPr>
+              <w:t>7.0%</w:t>
+            </w:r>
+          </w:p>
+        </w:tc>
+        <w:tc>
+          <w:tcPr>
+            <w:tcW w:type="dxa" w:w="2340"/>
+          </w:tcPr>
+          <w:p>
+            <w:pPr>
+              <w:spacing w:line="240" w:lineRule="auto"/>
+            </w:pPr>
+            <w:r>
+              <w:rPr>
+                <w:sz w:val="18"/>
+              </w:rPr>
+            </w:r>
+            <w:r>
+              <w:rPr>
+                <w:sz w:val="18"/>
+              </w:rPr>
+              <w:t>7.0%</w:t>
+            </w:r>
+          </w:p>
+        </w:tc>
+      </w:tr>
+      <w:tr>
+        <w:tc>
+          <w:tcPr>
+            <w:tcW w:type="dxa" w:w="2340"/>
+          </w:tcPr>
+          <w:p>
+            <w:pPr>
+              <w:spacing w:line="240" w:lineRule="auto"/>
+            </w:pPr>
+            <w:r>
+              <w:rPr>
+                <w:sz w:val="18"/>
+              </w:rPr>
+            </w:r>
+            <w:r>
+              <w:rPr>
+                <w:sz w:val="18"/>
+              </w:rPr>
+              <w:t>1,000 – 1,999</w:t>
+            </w:r>
+          </w:p>
+        </w:tc>
+        <w:tc>
+          <w:tcPr>
+            <w:tcW w:type="dxa" w:w="2340"/>
+          </w:tcPr>
+          <w:p>
+            <w:pPr>
+              <w:spacing w:line="240" w:lineRule="auto"/>
+            </w:pPr>
+            <w:r>
+              <w:rPr>
+                <w:sz w:val="18"/>
+              </w:rPr>
+            </w:r>
+            <w:r>
+              <w:rPr>
+                <w:sz w:val="18"/>
+              </w:rPr>
+              <w:t>109</w:t>
+            </w:r>
+          </w:p>
+        </w:tc>
+        <w:tc>
+          <w:tcPr>
+            <w:tcW w:type="dxa" w:w="2340"/>
+          </w:tcPr>
+          <w:p>
+            <w:pPr>
+              <w:spacing w:line="240" w:lineRule="auto"/>
+            </w:pPr>
+            <w:r>
+              <w:rPr>
+                <w:sz w:val="18"/>
+              </w:rPr>
+            </w:r>
+            <w:r>
+              <w:rPr>
+                <w:sz w:val="18"/>
+              </w:rPr>
+              <w:t>9.1%</w:t>
+            </w:r>
+          </w:p>
+        </w:tc>
+        <w:tc>
+          <w:tcPr>
+            <w:tcW w:type="dxa" w:w="2340"/>
+          </w:tcPr>
+          <w:p>
+            <w:pPr>
+              <w:spacing w:line="240" w:lineRule="auto"/>
+            </w:pPr>
+            <w:r>
+              <w:rPr>
+                <w:sz w:val="18"/>
+              </w:rPr>
+            </w:r>
+            <w:r>
+              <w:rPr>
+                <w:sz w:val="18"/>
+              </w:rPr>
+              <w:t>16.1%</w:t>
+            </w:r>
+          </w:p>
+        </w:tc>
+      </w:tr>
+      <w:tr>
+        <w:tc>
+          <w:tcPr>
+            <w:tcW w:type="dxa" w:w="2340"/>
+          </w:tcPr>
+          <w:p>
+            <w:pPr>
+              <w:spacing w:line="240" w:lineRule="auto"/>
+            </w:pPr>
+            <w:r>
+              <w:rPr>
+                <w:sz w:val="18"/>
+              </w:rPr>
+            </w:r>
+            <w:r>
+              <w:rPr>
+                <w:sz w:val="18"/>
+              </w:rPr>
+              <w:t>2,000 – 2,999</w:t>
+            </w:r>
+          </w:p>
+        </w:tc>
+        <w:tc>
+          <w:tcPr>
+            <w:tcW w:type="dxa" w:w="2340"/>
+          </w:tcPr>
+          <w:p>
+            <w:pPr>
+              <w:spacing w:line="240" w:lineRule="auto"/>
+            </w:pPr>
+            <w:r>
+              <w:rPr>
+                <w:sz w:val="18"/>
+              </w:rPr>
+            </w:r>
+            <w:r>
+              <w:rPr>
+                <w:sz w:val="18"/>
+              </w:rPr>
+              <w:t>136</w:t>
+            </w:r>
+          </w:p>
+        </w:tc>
+        <w:tc>
+          <w:tcPr>
+            <w:tcW w:type="dxa" w:w="2340"/>
+          </w:tcPr>
+          <w:p>
+            <w:pPr>
+              <w:spacing w:line="240" w:lineRule="auto"/>
+            </w:pPr>
+            <w:r>
+              <w:rPr>
+                <w:sz w:val="18"/>
+              </w:rPr>
+            </w:r>
+            <w:r>
+              <w:rPr>
+                <w:sz w:val="18"/>
+              </w:rPr>
+              <w:t>11.4%</w:t>
+            </w:r>
+          </w:p>
+        </w:tc>
+        <w:tc>
+          <w:tcPr>
+            <w:tcW w:type="dxa" w:w="2340"/>
+          </w:tcPr>
+          <w:p>
+            <w:pPr>
+              <w:spacing w:line="240" w:lineRule="auto"/>
+            </w:pPr>
+            <w:r>
+              <w:rPr>
+                <w:sz w:val="18"/>
+              </w:rPr>
+            </w:r>
+            <w:r>
+              <w:rPr>
+                <w:sz w:val="18"/>
+              </w:rPr>
+              <w:t>27.5%</w:t>
+            </w:r>
+          </w:p>
+        </w:tc>
+      </w:tr>
+      <w:tr>
+        <w:tc>
+          <w:tcPr>
+            <w:tcW w:type="dxa" w:w="2340"/>
+          </w:tcPr>
+          <w:p>
+            <w:pPr>
+              <w:spacing w:line="240" w:lineRule="auto"/>
+            </w:pPr>
+            <w:r>
+              <w:rPr>
+                <w:sz w:val="18"/>
+              </w:rPr>
+            </w:r>
+            <w:r>
+              <w:rPr>
+                <w:sz w:val="18"/>
+              </w:rPr>
+              <w:t>3,000 – 3,999</w:t>
+            </w:r>
+          </w:p>
+        </w:tc>
+        <w:tc>
+          <w:tcPr>
+            <w:tcW w:type="dxa" w:w="2340"/>
+          </w:tcPr>
+          <w:p>
+            <w:pPr>
+              <w:spacing w:line="240" w:lineRule="auto"/>
+            </w:pPr>
+            <w:r>
+              <w:rPr>
+                <w:sz w:val="18"/>
+              </w:rPr>
+            </w:r>
+            <w:r>
+              <w:rPr>
+                <w:sz w:val="18"/>
+              </w:rPr>
+              <w:t>136</w:t>
+            </w:r>
+          </w:p>
+        </w:tc>
+        <w:tc>
+          <w:tcPr>
+            <w:tcW w:type="dxa" w:w="2340"/>
+          </w:tcPr>
+          <w:p>
+            <w:pPr>
+              <w:spacing w:line="240" w:lineRule="auto"/>
+            </w:pPr>
+            <w:r>
+              <w:rPr>
+                <w:sz w:val="18"/>
+              </w:rPr>
+            </w:r>
+            <w:r>
+              <w:rPr>
+                <w:sz w:val="18"/>
+              </w:rPr>
+              <w:t>11.4%</w:t>
+            </w:r>
+          </w:p>
+        </w:tc>
+        <w:tc>
+          <w:tcPr>
+            <w:tcW w:type="dxa" w:w="2340"/>
+          </w:tcPr>
+          <w:p>
+            <w:pPr>
+              <w:spacing w:line="240" w:lineRule="auto"/>
+            </w:pPr>
+            <w:r>
+              <w:rPr>
+                <w:sz w:val="18"/>
+              </w:rPr>
+            </w:r>
+            <w:r>
+              <w:rPr>
+                <w:sz w:val="18"/>
+              </w:rPr>
+              <w:t>38.9%</w:t>
+            </w:r>
+          </w:p>
+        </w:tc>
+      </w:tr>
+      <w:tr>
+        <w:tc>
+          <w:tcPr>
+            <w:tcW w:type="dxa" w:w="2340"/>
+          </w:tcPr>
+          <w:p>
+            <w:pPr>
+              <w:spacing w:line="240" w:lineRule="auto"/>
+            </w:pPr>
+            <w:r>
+              <w:rPr>
+                <w:sz w:val="18"/>
+              </w:rPr>
+            </w:r>
+            <w:r>
+              <w:rPr>
+                <w:sz w:val="18"/>
+              </w:rPr>
+              <w:t>4,000 – 4,999</w:t>
+            </w:r>
+          </w:p>
+        </w:tc>
+        <w:tc>
+          <w:tcPr>
+            <w:tcW w:type="dxa" w:w="2340"/>
+          </w:tcPr>
+          <w:p>
+            <w:pPr>
+              <w:spacing w:line="240" w:lineRule="auto"/>
+            </w:pPr>
+            <w:r>
+              <w:rPr>
+                <w:sz w:val="18"/>
+              </w:rPr>
+            </w:r>
+            <w:r>
+              <w:rPr>
+                <w:sz w:val="18"/>
+              </w:rPr>
+              <w:t>113</w:t>
+            </w:r>
+          </w:p>
+        </w:tc>
+        <w:tc>
+          <w:tcPr>
+            <w:tcW w:type="dxa" w:w="2340"/>
+          </w:tcPr>
+          <w:p>
+            <w:pPr>
+              <w:spacing w:line="240" w:lineRule="auto"/>
+            </w:pPr>
+            <w:r>
+              <w:rPr>
+                <w:sz w:val="18"/>
+              </w:rPr>
+            </w:r>
+            <w:r>
+              <w:rPr>
+                <w:sz w:val="18"/>
+              </w:rPr>
+              <w:t>9.5%</w:t>
+            </w:r>
+          </w:p>
+        </w:tc>
+        <w:tc>
+          <w:tcPr>
+            <w:tcW w:type="dxa" w:w="2340"/>
+          </w:tcPr>
+          <w:p>
+            <w:pPr>
+              <w:spacing w:line="240" w:lineRule="auto"/>
+            </w:pPr>
+            <w:r>
+              <w:rPr>
+                <w:sz w:val="18"/>
+              </w:rPr>
+            </w:r>
+            <w:r>
+              <w:rPr>
+                <w:sz w:val="18"/>
+              </w:rPr>
+              <w:t>48.3%</w:t>
+            </w:r>
+          </w:p>
+        </w:tc>
+      </w:tr>
+      <w:tr>
+        <w:tc>
+          <w:tcPr>
+            <w:tcW w:type="dxa" w:w="2340"/>
+          </w:tcPr>
+          <w:p>
+            <w:pPr>
+              <w:spacing w:line="240" w:lineRule="auto"/>
+            </w:pPr>
+            <w:r>
+              <w:rPr>
+                <w:sz w:val="18"/>
+              </w:rPr>
+            </w:r>
+            <w:r>
+              <w:rPr>
+                <w:sz w:val="18"/>
+              </w:rPr>
+              <w:t>5,000 – 5,999</w:t>
+            </w:r>
+          </w:p>
+        </w:tc>
+        <w:tc>
+          <w:tcPr>
+            <w:tcW w:type="dxa" w:w="2340"/>
+          </w:tcPr>
+          <w:p>
+            <w:pPr>
+              <w:spacing w:line="240" w:lineRule="auto"/>
+            </w:pPr>
+            <w:r>
+              <w:rPr>
+                <w:sz w:val="18"/>
+              </w:rPr>
+            </w:r>
+            <w:r>
+              <w:rPr>
+                <w:sz w:val="18"/>
+              </w:rPr>
+              <w:t>126</w:t>
+            </w:r>
+          </w:p>
+        </w:tc>
+        <w:tc>
+          <w:tcPr>
+            <w:tcW w:type="dxa" w:w="2340"/>
+          </w:tcPr>
+          <w:p>
+            <w:pPr>
+              <w:spacing w:line="240" w:lineRule="auto"/>
+            </w:pPr>
+            <w:r>
+              <w:rPr>
+                <w:sz w:val="18"/>
+              </w:rPr>
+            </w:r>
+            <w:r>
+              <w:rPr>
+                <w:sz w:val="18"/>
+              </w:rPr>
+              <w:t>10.6%</w:t>
+            </w:r>
+          </w:p>
+        </w:tc>
+        <w:tc>
+          <w:tcPr>
+            <w:tcW w:type="dxa" w:w="2340"/>
+          </w:tcPr>
+          <w:p>
+            <w:pPr>
+              <w:spacing w:line="240" w:lineRule="auto"/>
+            </w:pPr>
+            <w:r>
+              <w:rPr>
+                <w:sz w:val="18"/>
+              </w:rPr>
+            </w:r>
+            <w:r>
+              <w:rPr>
+                <w:sz w:val="18"/>
+              </w:rPr>
+              <w:t>58.9%</w:t>
+            </w:r>
+          </w:p>
+        </w:tc>
+      </w:tr>
+      <w:tr>
+        <w:tc>
+          <w:tcPr>
+            <w:tcW w:type="dxa" w:w="2340"/>
+          </w:tcPr>
+          <w:p>
+            <w:pPr>
+              <w:spacing w:line="240" w:lineRule="auto"/>
+            </w:pPr>
+            <w:r>
+              <w:rPr>
+                <w:sz w:val="18"/>
+              </w:rPr>
+            </w:r>
+            <w:r>
+              <w:rPr>
+                <w:sz w:val="18"/>
+              </w:rPr>
+              <w:t>6,000 – 6,999</w:t>
+            </w:r>
+          </w:p>
+        </w:tc>
+        <w:tc>
+          <w:tcPr>
+            <w:tcW w:type="dxa" w:w="2340"/>
+          </w:tcPr>
+          <w:p>
+            <w:pPr>
+              <w:spacing w:line="240" w:lineRule="auto"/>
+            </w:pPr>
+            <w:r>
+              <w:rPr>
+                <w:sz w:val="18"/>
+              </w:rPr>
+            </w:r>
+            <w:r>
+              <w:rPr>
+                <w:sz w:val="18"/>
+              </w:rPr>
+              <w:t>122</w:t>
+            </w:r>
+          </w:p>
+        </w:tc>
+        <w:tc>
+          <w:tcPr>
+            <w:tcW w:type="dxa" w:w="2340"/>
+          </w:tcPr>
+          <w:p>
+            <w:pPr>
+              <w:spacing w:line="240" w:lineRule="auto"/>
+            </w:pPr>
+            <w:r>
+              <w:rPr>
+                <w:sz w:val="18"/>
+              </w:rPr>
+            </w:r>
+            <w:r>
+              <w:rPr>
+                <w:sz w:val="18"/>
+              </w:rPr>
+              <w:t>10.2%</w:t>
+            </w:r>
+          </w:p>
+        </w:tc>
+        <w:tc>
+          <w:tcPr>
+            <w:tcW w:type="dxa" w:w="2340"/>
+          </w:tcPr>
+          <w:p>
+            <w:pPr>
+              <w:spacing w:line="240" w:lineRule="auto"/>
+            </w:pPr>
+            <w:r>
+              <w:rPr>
+                <w:sz w:val="18"/>
+              </w:rPr>
+            </w:r>
+            <w:r>
+              <w:rPr>
+                <w:sz w:val="18"/>
+              </w:rPr>
+              <w:t>69.1%</w:t>
+            </w:r>
+          </w:p>
+        </w:tc>
+      </w:tr>
+      <w:tr>
+        <w:tc>
+          <w:tcPr>
+            <w:tcW w:type="dxa" w:w="2340"/>
+          </w:tcPr>
+          <w:p>
+            <w:pPr>
+              <w:spacing w:line="240" w:lineRule="auto"/>
+            </w:pPr>
+            <w:r>
+              <w:rPr>
+                <w:sz w:val="18"/>
+              </w:rPr>
+            </w:r>
+            <w:r>
+              <w:rPr>
+                <w:sz w:val="18"/>
+              </w:rPr>
+              <w:t>7,000 – 7,999</w:t>
+            </w:r>
+          </w:p>
+        </w:tc>
+        <w:tc>
+          <w:tcPr>
+            <w:tcW w:type="dxa" w:w="2340"/>
+          </w:tcPr>
+          <w:p>
+            <w:pPr>
+              <w:spacing w:line="240" w:lineRule="auto"/>
+            </w:pPr>
+            <w:r>
+              <w:rPr>
+                <w:sz w:val="18"/>
+              </w:rPr>
+            </w:r>
+            <w:r>
+              <w:rPr>
+                <w:sz w:val="18"/>
+              </w:rPr>
+              <w:t>118</w:t>
+            </w:r>
+          </w:p>
+        </w:tc>
+        <w:tc>
+          <w:tcPr>
+            <w:tcW w:type="dxa" w:w="2340"/>
+          </w:tcPr>
+          <w:p>
+            <w:pPr>
+              <w:spacing w:line="240" w:lineRule="auto"/>
+            </w:pPr>
+            <w:r>
+              <w:rPr>
+                <w:sz w:val="18"/>
+              </w:rPr>
+            </w:r>
+            <w:r>
+              <w:rPr>
+                <w:sz w:val="18"/>
+              </w:rPr>
+              <w:t>9.9%</w:t>
+            </w:r>
+          </w:p>
+        </w:tc>
+        <w:tc>
+          <w:tcPr>
+            <w:tcW w:type="dxa" w:w="2340"/>
+          </w:tcPr>
+          <w:p>
+            <w:pPr>
+              <w:spacing w:line="240" w:lineRule="auto"/>
+            </w:pPr>
+            <w:r>
+              <w:rPr>
+                <w:sz w:val="18"/>
+              </w:rPr>
+            </w:r>
+            <w:r>
+              <w:rPr>
+                <w:sz w:val="18"/>
+              </w:rPr>
+              <w:t>79.0%</w:t>
+            </w:r>
+          </w:p>
+        </w:tc>
+      </w:tr>
+      <w:tr>
+        <w:tc>
+          <w:tcPr>
+            <w:tcW w:type="dxa" w:w="2340"/>
+          </w:tcPr>
+          <w:p>
+            <w:pPr>
+              <w:spacing w:line="240" w:lineRule="auto"/>
+            </w:pPr>
+            <w:r>
+              <w:rPr>
+                <w:sz w:val="18"/>
+              </w:rPr>
+            </w:r>
+            <w:r>
+              <w:rPr>
+                <w:sz w:val="18"/>
+              </w:rPr>
+              <w:t>8,000 – 8,999</w:t>
+            </w:r>
+          </w:p>
+        </w:tc>
+        <w:tc>
+          <w:tcPr>
+            <w:tcW w:type="dxa" w:w="2340"/>
+          </w:tcPr>
+          <w:p>
+            <w:pPr>
+              <w:spacing w:line="240" w:lineRule="auto"/>
+            </w:pPr>
+            <w:r>
+              <w:rPr>
+                <w:sz w:val="18"/>
+              </w:rPr>
+            </w:r>
+            <w:r>
+              <w:rPr>
+                <w:sz w:val="18"/>
+              </w:rPr>
+              <w:t>123</w:t>
+            </w:r>
+          </w:p>
+        </w:tc>
+        <w:tc>
+          <w:tcPr>
+            <w:tcW w:type="dxa" w:w="2340"/>
+          </w:tcPr>
+          <w:p>
+            <w:pPr>
+              <w:spacing w:line="240" w:lineRule="auto"/>
+            </w:pPr>
+            <w:r>
+              <w:rPr>
+                <w:sz w:val="18"/>
+              </w:rPr>
+            </w:r>
+            <w:r>
+              <w:rPr>
+                <w:sz w:val="18"/>
+              </w:rPr>
+              <w:t>10.3%</w:t>
+            </w:r>
+          </w:p>
+        </w:tc>
+        <w:tc>
+          <w:tcPr>
+            <w:tcW w:type="dxa" w:w="2340"/>
+          </w:tcPr>
+          <w:p>
+            <w:pPr>
+              <w:spacing w:line="240" w:lineRule="auto"/>
+            </w:pPr>
+            <w:r>
+              <w:rPr>
+                <w:sz w:val="18"/>
+              </w:rPr>
+            </w:r>
+            <w:r>
+              <w:rPr>
+                <w:sz w:val="18"/>
+              </w:rPr>
+              <w:t>89.3%</w:t>
+            </w:r>
+          </w:p>
+        </w:tc>
+      </w:tr>
+      <w:tr>
+        <w:tc>
+          <w:tcPr>
+            <w:tcW w:type="dxa" w:w="2340"/>
+          </w:tcPr>
+          <w:p>
+            <w:pPr>
+              <w:spacing w:line="240" w:lineRule="auto"/>
+            </w:pPr>
+            <w:r>
+              <w:rPr>
+                <w:sz w:val="18"/>
+              </w:rPr>
+            </w:r>
+            <w:r>
+              <w:rPr>
+                <w:sz w:val="18"/>
+              </w:rPr>
+              <w:t>9,000 – 9,999</w:t>
+            </w:r>
+          </w:p>
+        </w:tc>
+        <w:tc>
+          <w:tcPr>
+            <w:tcW w:type="dxa" w:w="2340"/>
+          </w:tcPr>
+          <w:p>
+            <w:pPr>
+              <w:spacing w:line="240" w:lineRule="auto"/>
+            </w:pPr>
+            <w:r>
+              <w:rPr>
+                <w:sz w:val="18"/>
+              </w:rPr>
+            </w:r>
+            <w:r>
+              <w:rPr>
+                <w:sz w:val="18"/>
+              </w:rPr>
+              <w:t>128</w:t>
+            </w:r>
+          </w:p>
+        </w:tc>
+        <w:tc>
+          <w:tcPr>
+            <w:tcW w:type="dxa" w:w="2340"/>
+          </w:tcPr>
+          <w:p>
+            <w:pPr>
+              <w:spacing w:line="240" w:lineRule="auto"/>
+            </w:pPr>
+            <w:r>
+              <w:rPr>
+                <w:sz w:val="18"/>
+              </w:rPr>
+            </w:r>
+            <w:r>
+              <w:rPr>
+                <w:sz w:val="18"/>
+              </w:rPr>
+              <w:t>10.7%</w:t>
+            </w:r>
+          </w:p>
+        </w:tc>
+        <w:tc>
+          <w:tcPr>
+            <w:tcW w:type="dxa" w:w="2340"/>
+          </w:tcPr>
+          <w:p>
+            <w:pPr>
+              <w:spacing w:line="240" w:lineRule="auto"/>
+            </w:pPr>
+            <w:r>
+              <w:rPr>
+                <w:sz w:val="18"/>
+              </w:rPr>
+            </w:r>
+            <w:r>
+              <w:rPr>
+                <w:sz w:val="18"/>
+              </w:rPr>
+              <w:t>100.0%</w:t>
+            </w:r>
+          </w:p>
+        </w:tc>
+      </w:tr>
+      <w:tr>
+        <w:tc>
+          <w:tcPr>
+            <w:tcW w:type="dxa" w:w="2340"/>
+          </w:tcPr>
+          <w:p>
+            <w:pPr>
+              <w:spacing w:line="240" w:lineRule="auto"/>
+            </w:pPr>
+            <w:r>
+              <w:rPr>
+                <w:sz w:val="18"/>
+              </w:rPr>
+            </w:r>
+            <w:r>
+              <w:rPr>
+                <w:b/>
+                <w:sz w:val="18"/>
+              </w:rPr>
+              <w:t>Total</w:t>
+            </w:r>
+          </w:p>
+        </w:tc>
+        <w:tc>
+          <w:tcPr>
+            <w:tcW w:type="dxa" w:w="2340"/>
+          </w:tcPr>
+          <w:p>
+            <w:pPr>
+              <w:spacing w:line="240" w:lineRule="auto"/>
+            </w:pPr>
+            <w:r>
+              <w:rPr>
+                <w:sz w:val="18"/>
+              </w:rPr>
+            </w:r>
+            <w:r>
+              <w:rPr>
+                <w:b/>
+                <w:sz w:val="18"/>
+              </w:rPr>
+              <w:t>1,194</w:t>
+            </w:r>
+          </w:p>
+        </w:tc>
+        <w:tc>
+          <w:tcPr>
+            <w:tcW w:type="dxa" w:w="2340"/>
+          </w:tcPr>
+          <w:p>
+            <w:pPr>
+              <w:spacing w:line="240" w:lineRule="auto"/>
+            </w:pPr>
+            <w:r>
+              <w:rPr>
+                <w:sz w:val="18"/>
+              </w:rPr>
+            </w:r>
+            <w:r>
+              <w:rPr>
+                <w:b/>
+                <w:sz w:val="18"/>
+              </w:rPr>
+              <w:t>100.0%</w:t>
+            </w:r>
+          </w:p>
+        </w:tc>
+        <w:tc>
+          <w:tcPr>
+            <w:tcW w:type="dxa" w:w="2340"/>
+          </w:tcPr>
+          <w:p>
+            <w:pPr>
+              <w:spacing w:line="240" w:lineRule="auto"/>
+            </w:pPr>
+            <w:r>
+              <w:rPr>
+                <w:sz w:val="18"/>
+              </w:rPr>
+            </w:r>
+            <w:r>
+              <w:rPr>
+                <w:sz w:val="18"/>
+              </w:rPr>
+              <w:t>—</w:t>
+            </w:r>
+          </w:p>
+        </w:tc>
+      </w:tr>
+    </w:tbl>
+    <w:p>
+      <w:pPr>
+        <w:spacing w:after="200" w:line="240" w:lineRule="auto"/>
+        <w:jc w:val="center"/>
+      </w:pPr>
+      <w:r>
+        <w:rPr>
+          <w:i/>
+          <w:color w:val="7B8994"/>
+          <w:sz w:val="20"/>
+        </w:rPr>
+        <w:t>Table 5. Frequency distribution of transaction Amount, ten bins of 1,000.</w:t>
+      </w:r>
+    </w:p>
+    <w:p>
+      <w:r>
+        <w:t>No bin holds more than 11.4% of the rows and none holds less than 7.0%. A normal distribution would concentrate around the mean and thin out at both tails; this is close to flat, which is the shape a random number generator produces. Read the shape, not only the summary statistics.</w:t>
+      </w:r>
+    </w:p>
+    <w:p>
+      <w:pPr>
         <w:jc w:val="center"/>
       </w:pPr>
       <w:r>
@@ -3675,7 +4783,7 @@
           <w:color w:val="7B8994"/>
           <w:sz w:val="20"/>
         </w:rPr>
-        <w:t>Table 5. Correlation between monthly order count and monthly revenue.</w:t>
+        <w:t>Table 6. Correlation between monthly order count and monthly revenue.</w:t>
       </w:r>
     </w:p>
     <w:p>
@@ -4013,7 +5121,7 @@
           <w:color w:val="7B8994"/>
           <w:sz w:val="20"/>
         </w:rPr>
-        <w:t>Table 6. Correlation between units sold and order value at the transaction-line level.</w:t>
+        <w:t>Table 7. Correlation between units sold and order value at the transaction-line level.</w:t>
       </w:r>
     </w:p>
     <w:p>
@@ -4750,7 +5858,23 @@
           <w:color w:val="7B8994"/>
           <w:sz w:val="20"/>
         </w:rPr>
-        <w:t>Table 7. Simple linear regression of monthly revenue on monthly order count.</w:t>
+        <w:t>Table 8. Simple linear regression of monthly revenue on monthly order count.</w:t>
+      </w:r>
+    </w:p>
+    <w:p>
+      <w:r>
+        <w:t xml:space="preserve">_(Insert your screenshot of the Data Analysis ToolPak regression output here. The expected values are in the table above; the ToolPak procedure is in </w:t>
+      </w:r>
+      <w:r>
+        <w:rPr>
+          <w:rFonts w:ascii="Consolas" w:hAnsi="Consolas"/>
+          <w:color w:val="2F6F9F"/>
+          <w:sz w:val="18"/>
+        </w:rPr>
+        <w:t>docs/checkpoint2_excel_guide.md</w:t>
+      </w:r>
+      <w:r>
+        <w:t>, section 3.)_</w:t>
       </w:r>
     </w:p>
     <w:p>
@@ -5201,7 +6325,7 @@
           <w:color w:val="7B8994"/>
           <w:sz w:val="20"/>
         </w:rPr>
-        <w:t>Table 8. Predicted monthly revenue at different order volumes.</w:t>
+        <w:t>Table 9. Predicted monthly revenue at different order volumes.</w:t>
       </w:r>
     </w:p>
     <w:p>
@@ -5697,7 +6821,7 @@
           <w:color w:val="7B8994"/>
           <w:sz w:val="20"/>
         </w:rPr>
-        <w:t>Table 9. The trend in two regimes, measured on revenue per month.</w:t>
+        <w:t>Table 10. The trend in two regimes, measured on revenue per month.</w:t>
       </w:r>
     </w:p>
     <w:p>
@@ -5965,7 +7089,7 @@
           <w:color w:val="7B8994"/>
           <w:sz w:val="20"/>
         </w:rPr>
-        <w:t>Table 10. Regression of monthly revenue on a simple time index.</w:t>
+        <w:t>Table 11. Regression of monthly revenue on a simple time index.</w:t>
       </w:r>
     </w:p>
     <w:p>
@@ -6915,7 +8039,7 @@
           <w:color w:val="7B8994"/>
           <w:sz w:val="20"/>
         </w:rPr>
-        <w:t>Table 11. Seasonal index by calendar month, April 2020 to December 2024.</w:t>
+        <w:t>Table 12. Seasonal index by calendar month, April 2020 to December 2024.</w:t>
       </w:r>
     </w:p>
     <w:p>
@@ -7862,7 +8986,7 @@
           <w:color w:val="7B8994"/>
           <w:sz w:val="20"/>
         </w:rPr>
-        <w:t>Table 12. Six-period forecast with the two complete holdout months compared.</w:t>
+        <w:t>Table 13. Six-period forecast with the two complete holdout months compared.</w:t>
       </w:r>
     </w:p>
     <w:p>
@@ -8205,7 +9329,7 @@
           <w:color w:val="7B8994"/>
           <w:sz w:val="20"/>
         </w:rPr>
-        <w:t>Table 13. Forecast accuracy over the two complete holdout months.</w:t>
+        <w:t>Table 14. Forecast accuracy over the two complete holdout months.</w:t>
       </w:r>
     </w:p>
     <w:p>
@@ -8851,7 +9975,7 @@
           <w:color w:val="7B8994"/>
           <w:sz w:val="20"/>
         </w:rPr>
-        <w:t>Table 14. Checkpoint 2 artefacts and their locations.</w:t>
+        <w:t>Table 15. Checkpoint 2 artefacts and their locations.</w:t>
       </w:r>
     </w:p>
     <w:sectPr>

</xml_diff>